<commit_message>
Modele LDM : EURL au lieu de SAS, Gerant au lieu de President (MOON)
</commit_message>
<xml_diff>
--- a/lib/templates/ldm-bnc.docx
+++ b/lib/templates/ldm-bnc.docx
@@ -3732,7 +3732,7 @@
         <w:rPr>
           <w:rFonts w:cstheme="majorHAnsi"/>
         </w:rPr>
-        <w:t>Expert-comptable, Président</w:t>
+        <w:t>Expert-comptable, Gérant</w:t>
       </w:r>
     </w:p>
     <w:p>
@@ -7467,7 +7467,7 @@
                                 <w:sz w:val="16"/>
                                 <w:szCs w:val="11"/>
                               </w:rPr>
-                              <w:t>SAS au capital de 1 000 euros – NAF 6920Z – Siret 937 837 193 00013 – TVA FR13 937 837 193</w:t>
+                              <w:t>EURL au capital de 1 000 euros – NAF 6920Z – Siret 937 837 193 00013 – TVA FR13 937 837 193</w:t>
                             </w:r>
                           </w:p>
                         </w:txbxContent>
@@ -7643,7 +7643,7 @@
                           <w:sz w:val="16"/>
                           <w:szCs w:val="11"/>
                         </w:rPr>
-                        <w:t>SAS au capital de 1 000 euros – NAF 6920Z – Siret 937 837 193 00013 – TVA FR13 937 837 193</w:t>
+                        <w:t>EURL au capital de 1 000 euros – NAF 6920Z – Siret 937 837 193 00013 – TVA FR13 937 837 193</w:t>
                       </w:r>
                     </w:p>
                   </w:txbxContent>
@@ -7861,7 +7861,7 @@
                                 <w:sz w:val="16"/>
                                 <w:szCs w:val="11"/>
                               </w:rPr>
-                              <w:t>SAS</w:t>
+                              <w:t>EURL</w:t>
                             </w:r>
                             <w:r>
                               <w:rPr>
@@ -8100,7 +8100,7 @@
                           <w:sz w:val="16"/>
                           <w:szCs w:val="11"/>
                         </w:rPr>
-                        <w:t>SAS</w:t>
+                        <w:t>EURL</w:t>
                       </w:r>
                       <w:r>
                         <w:rPr>

</xml_diff>